<commit_message>
Update project documentation and files: Added new implementation plans, government one-pagers, and updated overview documents in both English and Japanese. Included all related PDFs and workspace files.
Co-authored-by: Qwen-Coder <qwen-coder@alibabacloud.com>
</commit_message>
<xml_diff>
--- a/mitsue_village_government_onepager_jp.docx
+++ b/mitsue_village_government_onepager_jp.docx
@@ -549,7 +549,7 @@
         <w:rPr>
           <w:rStyle w:val="text-11-c"/>
         </w:rPr>
-        <w:t xml:space="preserve">現段階でのお願い</w:t>
+        <w:t xml:space="preserve">村への経済的価値(目安)</w:t>
       </w:r>
     </w:p>
     <w:p>
@@ -560,34 +560,28 @@
         <w:rPr>
           <w:rStyle w:val="text-12-c"/>
         </w:rPr>
-        <w:t xml:space="preserve">現段階におきましては、以下の点についてお力添えを賜りたく存じます。</w:t>
-      </w:r>
-    </w:p>
-    <w:p>
-      <w:pPr>
-        <w:pStyle w:val="text-45"/>
-        <w:numPr>
-          <w:ilvl w:val="0"/>
-          <w:numId w:val="1"/>
-        </w:numPr>
-      </w:pPr>
-      <w:r>
-        <w:rPr>
-          <w:rStyle w:val="text-28-c"/>
-        </w:rPr>
-        <w:t xml:space="preserve">村の皆様にプロジェクトの内容をご説明させていただく </w:t>
-      </w:r>
+        <w:t xml:space="preserve">精緻な数値は第1段階のフィージビリティスタディから得られるものでございますが、初期段階の試算では、村にとって意義ある経済価値が見込まれます。</w:t>
+      </w:r>
+    </w:p>
+    <w:p>
+      <w:pPr>
+        <w:pStyle w:val="text-27"/>
+        <w:numPr>
+          <w:ilvl w:val="0"/>
+          <w:numId w:val="1"/>
+        </w:numPr>
+      </w:pPr>
       <w:r>
         <w:rPr>
           <w:rStyle w:val="text-27-c"/>
         </w:rPr>
-        <w:t xml:space="preserve">機会</w:t>
-      </w:r>
-      <w:r>
-        <w:rPr>
-          <w:rStyle w:val="text-28-c"/>
-        </w:rPr>
-        <w:t xml:space="preserve"> をいただきたいこと</w:t>
+        <w:t xml:space="preserve">現在の電力流出</w:t>
+      </w:r>
+      <w:r>
+        <w:rPr>
+          <w:rStyle w:val="text-28-c"/>
+        </w:rPr>
+        <w:t xml:space="preserve">: 御杖村からは電力購入として年間約¥4,000〜6,000万円が村外へと流出しております。地域発電により、この価値の一部を村内に留めることが可能となります。</w:t>
       </w:r>
     </w:p>
     <w:p>
@@ -602,40 +596,76 @@
         <w:rPr>
           <w:rStyle w:val="text-27-c"/>
         </w:rPr>
-        <w:t xml:space="preserve">地域住民および自治会</w:t>
-      </w:r>
-      <w:r>
-        <w:rPr>
-          <w:rStyle w:val="text-28-c"/>
-        </w:rPr>
-        <w:t xml:space="preserve"> の皆様への適切なご説明の進め方について、ご助言をいただきたいこと</w:t>
-      </w:r>
-    </w:p>
-    <w:p>
-      <w:pPr>
-        <w:pStyle w:val="text-45"/>
-        <w:numPr>
-          <w:ilvl w:val="0"/>
-          <w:numId w:val="1"/>
-        </w:numPr>
-      </w:pPr>
-      <w:r>
-        <w:rPr>
-          <w:rStyle w:val="text-28-c"/>
-        </w:rPr>
-        <w:t xml:space="preserve">初期調査(フィージビリティスタディ)の助成申請にあたり、</w:t>
-      </w:r>
+        <w:t xml:space="preserve">閉校舎の維持費</w:t>
+      </w:r>
+      <w:r>
+        <w:rPr>
+          <w:rStyle w:val="text-28-c"/>
+        </w:rPr>
+        <w:t xml:space="preserve">: 現在、年間¥300〜800万円の維持費を要する一方、収益を生んでおりません。活用により、塩漬けとなっていた資産から価値を創出いたします。</w:t>
+      </w:r>
+    </w:p>
+    <w:p>
+      <w:pPr>
+        <w:pStyle w:val="text-27"/>
+        <w:numPr>
+          <w:ilvl w:val="0"/>
+          <w:numId w:val="1"/>
+        </w:numPr>
+      </w:pPr>
       <w:r>
         <w:rPr>
           <w:rStyle w:val="text-27-c"/>
         </w:rPr>
-        <w:t xml:space="preserve">関心表明書(レター・オブ・インタレスト)</w:t>
-      </w:r>
-      <w:r>
-        <w:rPr>
-          <w:rStyle w:val="text-28-c"/>
-        </w:rPr>
-        <w:t xml:space="preserve"> をいただきたいこと</w:t>
+        <w:t xml:space="preserve">直接雇用</w:t>
+      </w:r>
+      <w:r>
+        <w:rPr>
+          <w:rStyle w:val="text-28-c"/>
+        </w:rPr>
+        <w:t xml:space="preserve">: 5年目までに、林業、施設運営、EV充電、管理業務において、地域雇用8〜15名を見込んでおります。</w:t>
+      </w:r>
+    </w:p>
+    <w:p>
+      <w:pPr>
+        <w:pStyle w:val="text-27"/>
+        <w:numPr>
+          <w:ilvl w:val="0"/>
+          <w:numId w:val="1"/>
+        </w:numPr>
+      </w:pPr>
+      <w:r>
+        <w:rPr>
+          <w:rStyle w:val="text-27-c"/>
+        </w:rPr>
+        <w:t xml:space="preserve">山林所有者の収入</w:t>
+      </w:r>
+      <w:r>
+        <w:rPr>
+          <w:rStyle w:val="text-28-c"/>
+        </w:rPr>
+        <w:t xml:space="preserve">: 持続可能な杉の伐採を通じ、民有山林所有者への新たな収入源を創出いたします。</w:t>
+      </w:r>
+    </w:p>
+    <w:p>
+      <w:pPr>
+        <w:pStyle w:val="text-27"/>
+        <w:numPr>
+          <w:ilvl w:val="0"/>
+          <w:numId w:val="1"/>
+        </w:numPr>
+      </w:pPr>
+      <w:r>
+        <w:rPr>
+          <w:rStyle w:val="text-27-c"/>
+        </w:rPr>
+        <w:t xml:space="preserve">5年目時点の年間経済活動(試算)</w:t>
+      </w:r>
+      <w:r>
+        <w:rPr>
+          <w:rStyle w:val="text-28-c"/>
+        </w:rPr>
+        <w:t xml:space="preserve">: ¥2,800〜6,700万円。そのうち相当部分が村内に留まる見込みです。</w:t>
       </w:r>
     </w:p>
     <w:p>
@@ -646,19 +676,7 @@
         <w:rPr>
           <w:rStyle w:val="text-12-c"/>
         </w:rPr>
-        <w:t xml:space="preserve">なお、現段階で </w:t>
-      </w:r>
-      <w:r>
-        <w:rPr>
-          <w:rStyle w:val="text-8-c"/>
-        </w:rPr>
-        <w:t xml:space="preserve">村の予算からの資金提供を求めるものではございません</w:t>
-      </w:r>
-      <w:r>
-        <w:rPr>
-          <w:rStyle w:val="text-12-c"/>
-        </w:rPr>
-        <w:t xml:space="preserve"> こと、申し添えます。</w:t>
+        <w:t xml:space="preserve">これらは目安となる範囲であり、正式な数値は第1段階において村と共に策定してまいります。</w:t>
       </w:r>
     </w:p>
     <w:p>
@@ -744,7 +762,7 @@
         <w:rPr>
           <w:rStyle w:val="text-11-c"/>
         </w:rPr>
-        <w:t xml:space="preserve">プロジェクトの運営体制</w:t>
+        <w:t xml:space="preserve">現段階でのお願い</w:t>
       </w:r>
     </w:p>
     <w:p>
@@ -755,109 +773,105 @@
         <w:rPr>
           <w:rStyle w:val="text-12-c"/>
         </w:rPr>
-        <w:t xml:space="preserve">プロジェクトの調整役として、専門の </w:t>
+        <w:t xml:space="preserve">現段階におきましては、以下の点についてお力添えを賜りたく存じます。</w:t>
+      </w:r>
+    </w:p>
+    <w:p>
+      <w:pPr>
+        <w:pStyle w:val="text-58"/>
+        <w:numPr>
+          <w:ilvl w:val="0"/>
+          <w:numId w:val="1"/>
+        </w:numPr>
+      </w:pPr>
+      <w:r>
+        <w:rPr>
+          <w:rStyle w:val="text-28-c"/>
+        </w:rPr>
+        <w:t xml:space="preserve">村の皆様にプロジェクトの内容をご説明させていただく </w:t>
+      </w:r>
+      <w:r>
+        <w:rPr>
+          <w:rStyle w:val="text-27-c"/>
+        </w:rPr>
+        <w:t xml:space="preserve">機会</w:t>
+      </w:r>
+      <w:r>
+        <w:rPr>
+          <w:rStyle w:val="text-28-c"/>
+        </w:rPr>
+        <w:t xml:space="preserve"> をいただきたいこと</w:t>
+      </w:r>
+    </w:p>
+    <w:p>
+      <w:pPr>
+        <w:pStyle w:val="text-27"/>
+        <w:numPr>
+          <w:ilvl w:val="0"/>
+          <w:numId w:val="1"/>
+        </w:numPr>
+      </w:pPr>
+      <w:r>
+        <w:rPr>
+          <w:rStyle w:val="text-27-c"/>
+        </w:rPr>
+        <w:t xml:space="preserve">地域住民および自治会</w:t>
+      </w:r>
+      <w:r>
+        <w:rPr>
+          <w:rStyle w:val="text-28-c"/>
+        </w:rPr>
+        <w:t xml:space="preserve"> の皆様への適切なご説明の進め方について、ご助言をいただきたいこと</w:t>
+      </w:r>
+    </w:p>
+    <w:p>
+      <w:pPr>
+        <w:pStyle w:val="text-58"/>
+        <w:numPr>
+          <w:ilvl w:val="0"/>
+          <w:numId w:val="1"/>
+        </w:numPr>
+      </w:pPr>
+      <w:r>
+        <w:rPr>
+          <w:rStyle w:val="text-28-c"/>
+        </w:rPr>
+        <w:t xml:space="preserve">初期調査(フィージビリティスタディ)の助成申請にあたり、</w:t>
+      </w:r>
+      <w:r>
+        <w:rPr>
+          <w:rStyle w:val="text-27-c"/>
+        </w:rPr>
+        <w:t xml:space="preserve">関心表明書(レター・オブ・インタレスト)</w:t>
+      </w:r>
+      <w:r>
+        <w:rPr>
+          <w:rStyle w:val="text-28-c"/>
+        </w:rPr>
+        <w:t xml:space="preserve"> をいただきたいこと</w:t>
+      </w:r>
+    </w:p>
+    <w:p>
+      <w:pPr>
+        <w:pStyle w:val="text-12"/>
+      </w:pPr>
+      <w:r>
+        <w:rPr>
+          <w:rStyle w:val="text-12-c"/>
+        </w:rPr>
+        <w:t xml:space="preserve">なお、現段階で </w:t>
       </w:r>
       <w:r>
         <w:rPr>
           <w:rStyle w:val="text-8-c"/>
         </w:rPr>
-        <w:t xml:space="preserve">特定非営利活動法人(NPO法人)</w:t>
+        <w:t xml:space="preserve">村の予算からの資金提供を求めるものではございません</w:t>
       </w:r>
       <w:r>
         <w:rPr>
           <w:rStyle w:val="text-12-c"/>
         </w:rPr>
-        <w:t xml:space="preserve"> を設立いたします。本NPOは、以下の関係者と透明性をもって連携してまいります。</w:t>
-      </w:r>
-    </w:p>
-    <w:p>
-      <w:pPr>
-        <w:pStyle w:val="text-45"/>
-        <w:numPr>
-          <w:ilvl w:val="0"/>
-          <w:numId w:val="1"/>
-        </w:numPr>
-      </w:pPr>
-      <w:r>
-        <w:rPr>
-          <w:rStyle w:val="text-28-c"/>
-        </w:rPr>
-        <w:t xml:space="preserve">御杖村役場</w:t>
-      </w:r>
-    </w:p>
-    <w:p>
-      <w:pPr>
-        <w:pStyle w:val="text-45"/>
-        <w:numPr>
-          <w:ilvl w:val="0"/>
-          <w:numId w:val="1"/>
-        </w:numPr>
-      </w:pPr>
-      <w:r>
-        <w:rPr>
-          <w:rStyle w:val="text-28-c"/>
-        </w:rPr>
-        <w:t xml:space="preserve">地域住民および自治会</w:t>
-      </w:r>
-    </w:p>
-    <w:p>
-      <w:pPr>
-        <w:pStyle w:val="text-45"/>
-        <w:numPr>
-          <w:ilvl w:val="0"/>
-          <w:numId w:val="1"/>
-        </w:numPr>
-      </w:pPr>
-      <w:r>
-        <w:rPr>
-          <w:rStyle w:val="text-28-c"/>
-        </w:rPr>
-        <w:t xml:space="preserve">山林の私有所有者</w:t>
-      </w:r>
-    </w:p>
-    <w:p>
-      <w:pPr>
-        <w:pStyle w:val="text-45"/>
-        <w:numPr>
-          <w:ilvl w:val="0"/>
-          <w:numId w:val="1"/>
-        </w:numPr>
-      </w:pPr>
-      <w:r>
-        <w:rPr>
-          <w:rStyle w:val="text-28-c"/>
-        </w:rPr>
-        <w:t xml:space="preserve">林業事業者</w:t>
-      </w:r>
-    </w:p>
-    <w:p>
-      <w:pPr>
-        <w:pStyle w:val="text-45"/>
-        <w:numPr>
-          <w:ilvl w:val="0"/>
-          <w:numId w:val="1"/>
-        </w:numPr>
-      </w:pPr>
-      <w:r>
-        <w:rPr>
-          <w:rStyle w:val="text-28-c"/>
-        </w:rPr>
-        <w:t xml:space="preserve">奈良県および国の関係機関(林野庁、経済産業省等)</w:t>
-      </w:r>
-    </w:p>
-    <w:p>
-      <w:pPr>
-        <w:pStyle w:val="text-45"/>
-        <w:numPr>
-          <w:ilvl w:val="0"/>
-          <w:numId w:val="1"/>
-        </w:numPr>
-      </w:pPr>
-      <w:r>
-        <w:rPr>
-          <w:rStyle w:val="text-28-c"/>
-        </w:rPr>
-        <w:t xml:space="preserve">学術機関および技術パートナー</w:t>
+        <w:t xml:space="preserve"> こと、申し添えます。</w:t>
       </w:r>
     </w:p>
     <w:p>
@@ -943,100 +957,120 @@
         <w:rPr>
           <w:rStyle w:val="text-11-c"/>
         </w:rPr>
-        <w:t xml:space="preserve">私どものご紹介</w:t>
-      </w:r>
-    </w:p>
-    <w:p>
-      <w:pPr>
-        <w:pStyle w:val="text-8"/>
-      </w:pPr>
+        <w:t xml:space="preserve">プロジェクトの運営体制</w:t>
+      </w:r>
+    </w:p>
+    <w:p>
+      <w:pPr>
+        <w:pStyle w:val="text-12"/>
+      </w:pPr>
+      <w:r>
+        <w:rPr>
+          <w:rStyle w:val="text-12-c"/>
+        </w:rPr>
+        <w:t xml:space="preserve">プロジェクトの調整役として、専門の </w:t>
+      </w:r>
       <w:r>
         <w:rPr>
           <w:rStyle w:val="text-8-c"/>
         </w:rPr>
-        <w:t xml:space="preserve">ロブ・アウデンダイク(Rob Oudendijk)</w:t>
+        <w:t xml:space="preserve">特定非営利活動法人(NPO法人)</w:t>
       </w:r>
       <w:r>
         <w:rPr>
           <w:rStyle w:val="text-12-c"/>
         </w:rPr>
-        <w:t xml:space="preserve"> ―― オランダ人電気技術者。2012年より御杖村菅野に在住。世界的な市民科学による放射線モニタリングネットワーク Safecast(セーフキャスト)の主要ハードウェア開発者。</w:t>
-      </w:r>
-    </w:p>
-    <w:p>
-      <w:pPr>
-        <w:pStyle w:val="text-8"/>
-      </w:pPr>
-      <w:r>
-        <w:rPr>
-          <w:rStyle w:val="text-8-c"/>
-        </w:rPr>
-        <w:t xml:space="preserve">アドバイザー:</w:t>
-      </w:r>
-    </w:p>
-    <w:p>
-      <w:pPr>
-        <w:pStyle w:val="text-27"/>
-        <w:numPr>
-          <w:ilvl w:val="0"/>
-          <w:numId w:val="1"/>
-        </w:numPr>
-      </w:pPr>
-      <w:r>
-        <w:rPr>
-          <w:rStyle w:val="text-27-c"/>
-        </w:rPr>
-        <w:t xml:space="preserve">伊藤穰一氏</w:t>
-      </w:r>
-      <w:r>
-        <w:rPr>
-          <w:rStyle w:val="text-28-c"/>
-        </w:rPr>
-        <w:t xml:space="preserve"> ―― 元MITメディアラボ所長</w:t>
-      </w:r>
-    </w:p>
-    <w:p>
-      <w:pPr>
-        <w:pStyle w:val="text-27"/>
-        <w:numPr>
-          <w:ilvl w:val="0"/>
-          <w:numId w:val="1"/>
-        </w:numPr>
-      </w:pPr>
-      <w:r>
-        <w:rPr>
-          <w:rStyle w:val="text-27-c"/>
-        </w:rPr>
-        <w:t xml:space="preserve">レイ・オジー氏</w:t>
-      </w:r>
-      <w:r>
-        <w:rPr>
-          <w:rStyle w:val="text-28-c"/>
-        </w:rPr>
-        <w:t xml:space="preserve"> ―― ソフトウェア開発の先駆者、マイクロソフト元最高ソフトウェア責任者</w:t>
-      </w:r>
-    </w:p>
-    <w:p>
-      <w:pPr>
-        <w:pStyle w:val="text-12"/>
-      </w:pPr>
-      <w:r>
-        <w:rPr>
-          <w:rStyle w:val="text-12-c"/>
-        </w:rPr>
-        <w:t xml:space="preserve">また、本プロジェクトに対しましては、</w:t>
-      </w:r>
-      <w:r>
-        <w:rPr>
-          <w:rStyle w:val="text-8-c"/>
-        </w:rPr>
-        <w:t xml:space="preserve">駐大阪オランダ王国総領事 サンドラ・ペレグロム閣下</w:t>
-      </w:r>
-      <w:r>
-        <w:rPr>
-          <w:rStyle w:val="text-12-c"/>
-        </w:rPr>
-        <w:t xml:space="preserve"> より、日蘭間の持続可能な協力の一例としてご関心をお寄せいただいております。</w:t>
+        <w:t xml:space="preserve"> を設立いたします。本NPOは、以下の関係者と透明性をもって連携してまいります。</w:t>
+      </w:r>
+    </w:p>
+    <w:p>
+      <w:pPr>
+        <w:pStyle w:val="text-58"/>
+        <w:numPr>
+          <w:ilvl w:val="0"/>
+          <w:numId w:val="1"/>
+        </w:numPr>
+      </w:pPr>
+      <w:r>
+        <w:rPr>
+          <w:rStyle w:val="text-28-c"/>
+        </w:rPr>
+        <w:t xml:space="preserve">御杖村役場</w:t>
+      </w:r>
+    </w:p>
+    <w:p>
+      <w:pPr>
+        <w:pStyle w:val="text-58"/>
+        <w:numPr>
+          <w:ilvl w:val="0"/>
+          <w:numId w:val="1"/>
+        </w:numPr>
+      </w:pPr>
+      <w:r>
+        <w:rPr>
+          <w:rStyle w:val="text-28-c"/>
+        </w:rPr>
+        <w:t xml:space="preserve">地域住民および自治会</w:t>
+      </w:r>
+    </w:p>
+    <w:p>
+      <w:pPr>
+        <w:pStyle w:val="text-58"/>
+        <w:numPr>
+          <w:ilvl w:val="0"/>
+          <w:numId w:val="1"/>
+        </w:numPr>
+      </w:pPr>
+      <w:r>
+        <w:rPr>
+          <w:rStyle w:val="text-28-c"/>
+        </w:rPr>
+        <w:t xml:space="preserve">山林の私有所有者</w:t>
+      </w:r>
+    </w:p>
+    <w:p>
+      <w:pPr>
+        <w:pStyle w:val="text-58"/>
+        <w:numPr>
+          <w:ilvl w:val="0"/>
+          <w:numId w:val="1"/>
+        </w:numPr>
+      </w:pPr>
+      <w:r>
+        <w:rPr>
+          <w:rStyle w:val="text-28-c"/>
+        </w:rPr>
+        <w:t xml:space="preserve">林業事業者</w:t>
+      </w:r>
+    </w:p>
+    <w:p>
+      <w:pPr>
+        <w:pStyle w:val="text-58"/>
+        <w:numPr>
+          <w:ilvl w:val="0"/>
+          <w:numId w:val="1"/>
+        </w:numPr>
+      </w:pPr>
+      <w:r>
+        <w:rPr>
+          <w:rStyle w:val="text-28-c"/>
+        </w:rPr>
+        <w:t xml:space="preserve">奈良県および国の関係機関(林野庁、経済産業省等)</w:t>
+      </w:r>
+    </w:p>
+    <w:p>
+      <w:pPr>
+        <w:pStyle w:val="text-58"/>
+        <w:numPr>
+          <w:ilvl w:val="0"/>
+          <w:numId w:val="1"/>
+        </w:numPr>
+      </w:pPr>
+      <w:r>
+        <w:rPr>
+          <w:rStyle w:val="text-28-c"/>
+        </w:rPr>
+        <w:t xml:space="preserve">学術機関および技術パートナー</w:t>
       </w:r>
     </w:p>
     <w:p>
@@ -1122,7 +1156,35 @@
         <w:rPr>
           <w:rStyle w:val="text-11-c"/>
         </w:rPr>
-        <w:t xml:space="preserve">私どもの基本姿勢</w:t>
+        <w:t xml:space="preserve">私どものご紹介</w:t>
+      </w:r>
+    </w:p>
+    <w:p>
+      <w:pPr>
+        <w:pStyle w:val="text-8"/>
+      </w:pPr>
+      <w:r>
+        <w:rPr>
+          <w:rStyle w:val="text-8-c"/>
+        </w:rPr>
+        <w:t xml:space="preserve">ロブ・アウデンダイク(Rob Oudendijk)</w:t>
+      </w:r>
+      <w:r>
+        <w:rPr>
+          <w:rStyle w:val="text-12-c"/>
+        </w:rPr>
+        <w:t xml:space="preserve"> ―― オランダ人電気技術者。2012年より御杖村菅野に在住。世界的な市民科学による放射線モニタリングネットワーク Safecast(セーフキャスト)の主要ハードウェア開発者。</w:t>
+      </w:r>
+    </w:p>
+    <w:p>
+      <w:pPr>
+        <w:pStyle w:val="text-8"/>
+      </w:pPr>
+      <w:r>
+        <w:rPr>
+          <w:rStyle w:val="text-8-c"/>
+        </w:rPr>
+        <w:t xml:space="preserve">アドバイザー:</w:t>
       </w:r>
     </w:p>
     <w:p>
@@ -1137,13 +1199,13 @@
         <w:rPr>
           <w:rStyle w:val="text-27-c"/>
         </w:rPr>
-        <w:t xml:space="preserve">地域を最優先に。</w:t>
-      </w:r>
-      <w:r>
-        <w:rPr>
-          <w:rStyle w:val="text-28-c"/>
-        </w:rPr>
-        <w:t xml:space="preserve"> 御杖村の住民の皆様と山林所有者の方々が、このプロジェクトの礎です。</w:t>
+        <w:t xml:space="preserve">伊藤穰一氏</w:t>
+      </w:r>
+      <w:r>
+        <w:rPr>
+          <w:rStyle w:val="text-28-c"/>
+        </w:rPr>
+        <w:t xml:space="preserve"> ―― 元MITメディアラボ所長</w:t>
       </w:r>
     </w:p>
     <w:p>
@@ -1158,55 +1220,36 @@
         <w:rPr>
           <w:rStyle w:val="text-27-c"/>
         </w:rPr>
-        <w:t xml:space="preserve">不意打ちのないように。</w:t>
-      </w:r>
-      <w:r>
-        <w:rPr>
-          <w:rStyle w:val="text-28-c"/>
-        </w:rPr>
-        <w:t xml:space="preserve"> 情報を率直に共有し、各段階でご意見を仰ぎながら進めます。</w:t>
-      </w:r>
-    </w:p>
-    <w:p>
-      <w:pPr>
-        <w:pStyle w:val="text-27"/>
-        <w:numPr>
-          <w:ilvl w:val="0"/>
-          <w:numId w:val="1"/>
-        </w:numPr>
-      </w:pPr>
-      <w:r>
-        <w:rPr>
-          <w:rStyle w:val="text-27-c"/>
-        </w:rPr>
-        <w:t xml:space="preserve">着実に、控えめに。</w:t>
-      </w:r>
-      <w:r>
-        <w:rPr>
-          <w:rStyle w:val="text-28-c"/>
-        </w:rPr>
-        <w:t xml:space="preserve"> 25年の長期的視点に立ち、目立つことを目的としません。</w:t>
-      </w:r>
-    </w:p>
-    <w:p>
-      <w:pPr>
-        <w:pStyle w:val="text-27"/>
-        <w:numPr>
-          <w:ilvl w:val="0"/>
-          <w:numId w:val="1"/>
-        </w:numPr>
-      </w:pPr>
-      <w:r>
-        <w:rPr>
-          <w:rStyle w:val="text-27-c"/>
-        </w:rPr>
-        <w:t xml:space="preserve">再現可能なかたちで。</w:t>
-      </w:r>
-      <w:r>
-        <w:rPr>
-          <w:rStyle w:val="text-28-c"/>
-        </w:rPr>
-        <w:t xml:space="preserve"> 御杖で得られた知見を共有し、他の地域にも役立てていただけるようにいたします。</w:t>
+        <w:t xml:space="preserve">レイ・オジー氏</w:t>
+      </w:r>
+      <w:r>
+        <w:rPr>
+          <w:rStyle w:val="text-28-c"/>
+        </w:rPr>
+        <w:t xml:space="preserve"> ―― ソフトウェア開発の先駆者、マイクロソフト元最高ソフトウェア責任者</w:t>
+      </w:r>
+    </w:p>
+    <w:p>
+      <w:pPr>
+        <w:pStyle w:val="text-12"/>
+      </w:pPr>
+      <w:r>
+        <w:rPr>
+          <w:rStyle w:val="text-12-c"/>
+        </w:rPr>
+        <w:t xml:space="preserve">また、本プロジェクトに対しましては、</w:t>
+      </w:r>
+      <w:r>
+        <w:rPr>
+          <w:rStyle w:val="text-8-c"/>
+        </w:rPr>
+        <w:t xml:space="preserve">駐大阪オランダ王国総領事 サンドラ・ペレグロム閣下</w:t>
+      </w:r>
+      <w:r>
+        <w:rPr>
+          <w:rStyle w:val="text-12-c"/>
+        </w:rPr>
+        <w:t xml:space="preserve"> より、日蘭間の持続可能な協力の一例としてご関心をお寄せいただいております。</w:t>
       </w:r>
     </w:p>
     <w:p>
@@ -1292,18 +1335,91 @@
         <w:rPr>
           <w:rStyle w:val="text-11-c"/>
         </w:rPr>
-        <w:t xml:space="preserve">次のステップ</w:t>
-      </w:r>
-    </w:p>
-    <w:p>
-      <w:pPr>
-        <w:pStyle w:val="text-12"/>
-      </w:pPr>
-      <w:r>
-        <w:rPr>
-          <w:rStyle w:val="text-12-c"/>
-        </w:rPr>
-        <w:t xml:space="preserve">ご都合のよろしい折に、村の皆様とお話しする機会を頂戴できますよう、何卒よろしくお願い申し上げます。</w:t>
+        <w:t xml:space="preserve">私どもの基本姿勢</w:t>
+      </w:r>
+    </w:p>
+    <w:p>
+      <w:pPr>
+        <w:pStyle w:val="text-27"/>
+        <w:numPr>
+          <w:ilvl w:val="0"/>
+          <w:numId w:val="1"/>
+        </w:numPr>
+      </w:pPr>
+      <w:r>
+        <w:rPr>
+          <w:rStyle w:val="text-27-c"/>
+        </w:rPr>
+        <w:t xml:space="preserve">地域を最優先に。</w:t>
+      </w:r>
+      <w:r>
+        <w:rPr>
+          <w:rStyle w:val="text-28-c"/>
+        </w:rPr>
+        <w:t xml:space="preserve"> 御杖村の住民の皆様と山林所有者の方々が、このプロジェクトの礎です。</w:t>
+      </w:r>
+    </w:p>
+    <w:p>
+      <w:pPr>
+        <w:pStyle w:val="text-27"/>
+        <w:numPr>
+          <w:ilvl w:val="0"/>
+          <w:numId w:val="1"/>
+        </w:numPr>
+      </w:pPr>
+      <w:r>
+        <w:rPr>
+          <w:rStyle w:val="text-27-c"/>
+        </w:rPr>
+        <w:t xml:space="preserve">不意打ちのないように。</w:t>
+      </w:r>
+      <w:r>
+        <w:rPr>
+          <w:rStyle w:val="text-28-c"/>
+        </w:rPr>
+        <w:t xml:space="preserve"> 情報を率直に共有し、各段階でご意見を仰ぎながら進めます。</w:t>
+      </w:r>
+    </w:p>
+    <w:p>
+      <w:pPr>
+        <w:pStyle w:val="text-27"/>
+        <w:numPr>
+          <w:ilvl w:val="0"/>
+          <w:numId w:val="1"/>
+        </w:numPr>
+      </w:pPr>
+      <w:r>
+        <w:rPr>
+          <w:rStyle w:val="text-27-c"/>
+        </w:rPr>
+        <w:t xml:space="preserve">着実に、控えめに。</w:t>
+      </w:r>
+      <w:r>
+        <w:rPr>
+          <w:rStyle w:val="text-28-c"/>
+        </w:rPr>
+        <w:t xml:space="preserve"> 25年の長期的視点に立ち、目立つことを目的としません。</w:t>
+      </w:r>
+    </w:p>
+    <w:p>
+      <w:pPr>
+        <w:pStyle w:val="text-27"/>
+        <w:numPr>
+          <w:ilvl w:val="0"/>
+          <w:numId w:val="1"/>
+        </w:numPr>
+      </w:pPr>
+      <w:r>
+        <w:rPr>
+          <w:rStyle w:val="text-27-c"/>
+        </w:rPr>
+        <w:t xml:space="preserve">再現可能なかたちで。</w:t>
+      </w:r>
+      <w:r>
+        <w:rPr>
+          <w:rStyle w:val="text-28-c"/>
+        </w:rPr>
+        <w:t xml:space="preserve"> 御杖で得られた知見を共有し、他の地域にも役立てていただけるようにいたします。</w:t>
       </w:r>
     </w:p>
     <w:p>
@@ -1383,11 +1499,108 @@
     </w:p>
     <w:p>
       <w:pPr>
-        <w:pStyle w:val="text-89"/>
-      </w:pPr>
-      <w:r>
-        <w:rPr>
-          <w:rStyle w:val="text-89-c"/>
+        <w:pStyle w:val="text-11"/>
+      </w:pPr>
+      <w:r>
+        <w:rPr>
+          <w:rStyle w:val="text-11-c"/>
+        </w:rPr>
+        <w:t xml:space="preserve">次のステップ</w:t>
+      </w:r>
+    </w:p>
+    <w:p>
+      <w:pPr>
+        <w:pStyle w:val="text-12"/>
+      </w:pPr>
+      <w:r>
+        <w:rPr>
+          <w:rStyle w:val="text-12-c"/>
+        </w:rPr>
+        <w:t xml:space="preserve">ご都合のよろしい折に、村の皆様とお話しする機会を頂戴できますよう、何卒よろしくお願い申し上げます。</w:t>
+      </w:r>
+    </w:p>
+    <w:p>
+      <w:pPr>
+        <w:jc w:val="center"/>
+      </w:pPr>
+      <w:r>
+        <mc:AlternateContent>
+          <mc:Choice Requires="wpg">
+            <w:drawing>
+              <wp:inline xmlns:wp="http://schemas.openxmlformats.org/drawingml/2006/wordprocessingDrawing" distT="0" distB="0" distL="0" distR="0">
+                <wp:extent cx="5943600" cy="0"/>
+                <wp:effectExtent l="0" t="0" r="0" b="0"/>
+                <wp:docPr id="9" name="Line 9"/>
+                <wp:cNvGraphicFramePr/>
+                <a:graphic xmlns:a="http://schemas.openxmlformats.org/drawingml/2006/main">
+                  <a:graphicData uri="http://schemas.microsoft.com/office/word/2010/wordprocessingShape">
+                    <wps:wsp>
+                      <wps:cNvPr id="0" name=""/>
+                      <wps:cNvSpPr/>
+                      <wps:spPr>
+                        <a:xfrm>
+                          <a:off x="0" y="0"/>
+                          <a:ext cx="5943600" cy="0"/>
+                        </a:xfrm>
+                        <a:custGeom>
+                          <a:avLst/>
+                          <a:gdLst/>
+                          <a:ahLst/>
+                          <a:cxnLst/>
+                          <a:rect l="0" t="0" r="r" b="b"/>
+                          <a:pathLst>
+                            <a:path>
+                              <a:moveTo>
+                                <a:pt x="0" y="0"/>
+                              </a:moveTo>
+                              <a:lnTo>
+                                <a:pt x="5943600" y="0"/>
+                              </a:lnTo>
+                            </a:path>
+                          </a:pathLst>
+                        </a:custGeom>
+                        <a:ln w="14288">
+                          <a:solidFill>
+                            <a:srgbClr val="808080"/>
+                          </a:solidFill>
+                        </a:ln>
+                        <a:scene3d>
+                          <a:camera prst="orthographicFront"/>
+                          <a:lightRig rig="threePt" dir="t"/>
+                        </a:scene3d>
+                        <a:sp3d>
+                          <a:bevelT prst="angle"/>
+                        </a:sp3d>
+                      </wps:spPr>
+                      <wps:bodyPr rot="0">
+                        <a:prstTxWarp prst="textNoShape">
+                          <a:avLst/>
+                        </a:prstTxWarp>
+                        <a:noAutofit/>
+                      </wps:bodyPr>
+                    </wps:wsp>
+                  </a:graphicData>
+                </a:graphic>
+              </wp:inline>
+            </w:drawing>
+          </mc:Choice>
+          <mc:Fallback>
+            <w:pict>
+              <v:shape id="shape 8" o:spid="_x0000_s8" style="width:468.00pt;height:0.00pt;mso-wrap-distance-left:0.00pt;mso-wrap-distance-top:0.00pt;mso-wrap-distance-right:0.00pt;mso-wrap-distance-bottom:0.00pt;visibility:visible;" path="m0,0l13758333,0e" coordsize="100000,100000" filled="f" strokecolor="#808080" strokeweight="1.13pt">
+                <v:path textboxrect="0,0,0,0"/>
+              </v:shape>
+            </w:pict>
+          </mc:Fallback>
+        </mc:AlternateContent>
+      </w:r>
+    </w:p>
+    <w:p>
+      <w:pPr>
+        <w:pStyle w:val="text-102"/>
+      </w:pPr>
+      <w:r>
+        <w:rPr>
+          <w:rStyle w:val="text-102-c"/>
         </w:rPr>
         <w:t xml:space="preserve">ロブ・アウデンダイク</w:t>
       </w:r>
@@ -1402,7 +1615,7 @@
       </w:r>
       <w:r>
         <w:rPr>
-          <w:rStyle w:val="text-89-c"/>
+          <w:rStyle w:val="text-102-c"/>
         </w:rPr>
         <w:t xml:space="preserve">奈良県宇陀郡御杖村菅野</w:t>
       </w:r>
@@ -1417,7 +1630,7 @@
       </w:r>
       <w:r>
         <w:rPr>
-          <w:rStyle w:val="text-89-c"/>
+          <w:rStyle w:val="text-102-c"/>
         </w:rPr>
         <w:t xml:space="preserve">[ご連絡先]</w:t>
       </w:r>
@@ -2106,23 +2319,23 @@
       <w:color w:val="000000"/>
     </w:rPr>
   </w:style>
-  <w:style w:type="paragraph" w:styleId="text-45" w:customStyle="1">
-    <w:name w:val="text-45"/>
+  <w:style w:type="paragraph" w:styleId="text-58" w:customStyle="1">
+    <w:name w:val="text-58"/>
     <w:basedOn w:val="li"/>
     <w:qFormat/>
     <w:pPr>
       <w:spacing w:after="150" w:afterAutospacing="1"/>
     </w:pPr>
   </w:style>
-  <w:style w:type="paragraph" w:styleId="text-89" w:customStyle="1">
-    <w:name w:val="text-89"/>
+  <w:style w:type="paragraph" w:styleId="text-102" w:customStyle="1">
+    <w:name w:val="text-102"/>
     <w:qFormat/>
     <w:pPr>
       <w:spacing w:after="150" w:afterAutospacing="1"/>
     </w:pPr>
   </w:style>
-  <w:style w:type="character" w:styleId="text-89-c" w:customStyle="1">
-    <w:name w:val="text-89-c"/>
+  <w:style w:type="character" w:styleId="text-102-c" w:customStyle="1">
+    <w:name w:val="text-102-c"/>
     <w:rPr>
       <w:rFonts w:ascii="Arial" w:hAnsi="Arial" w:eastAsia="Arial" w:cs="Arial"/>
       <w:i/>

</xml_diff>